<commit_message>
modified:   .DS_Store 	modified:   materials/.DS_Store 	modified:   materials/UNFCCC/UNFCCC Annotations.docx 	deleted:    materials/UNFCCC/~$oto Protocol Annotated.docx 	deleted:    materials/UNFCCC/~$ris Annotations.docx 	modified:   texts/.DS_Store 	modified:   texts/kyoto-notes.js 	new file:   texts/unfccc-builder/.DS_Store 	new file:   texts/unfccc-builder/Take 2 UNFCCC Annotations.docx 	new file:   texts/unfccc-builder/requirements.txt 	new file:   texts/unfccc-builder/unfccc-body.html 	new file:   texts/unfccc-builder/unfccc_to_html.py 	new file:   texts/unfccc-notes.js 	new file:   texts/unfccc.html
</commit_message>
<xml_diff>
--- a/materials/UNFCCC/UNFCCC Annotations.docx
+++ b/materials/UNFCCC/UNFCCC Annotations.docx
@@ -771,15 +771,7 @@
       <w:commentRangeStart w:id="1"/>
       <w:commentRangeStart w:id="2"/>
       <w:r>
-        <w:t xml:space="preserve">global emissions of greenhouse gases </w:t>
-      </w:r>
-      <w:proofErr w:type="gramStart"/>
-      <w:r>
-        <w:t>has</w:t>
-      </w:r>
-      <w:proofErr w:type="gramEnd"/>
-      <w:r>
-        <w:t xml:space="preserve"> originated in developed countries, that per capita emissions in developing countries are still relatively low and that the share of global</w:t>
+        <w:t>global emissions of greenhouse gases has originated in developed countries, that per capita emissions in developing countries are still relatively low and that the share of global</w:t>
       </w:r>
       <w:r>
         <w:rPr>

</xml_diff>